<commit_message>
charity: rebuild the send-out deliverables from the corrected manuscript
Co-Authored-By: Claude Opus 5 <noreply@anthropic.com>
</commit_message>
<xml_diff>
--- a/docs/campfire-body-edit.docx
+++ b/docs/campfire-body-edit.docx
@@ -258,7 +258,7 @@
           <w:spacing w:val="0"/>
           <w:color w:val="646464"/>
         </w:rPr>
-        <w:t xml:space="preserve">［画像：group_field.jpg　メンバー3人］</w:t>
+        <w:t xml:space="preserve">［画像：group_band.jpg　メンバー3人］</w:t>
       </w:r>
     </w:p>
     <w:p>
@@ -835,55 +835,46 @@
           <w:sz-cs w:val="29"/>
           <w:spacing w:val="0"/>
         </w:rPr>
-        <w:t xml:space="preserve">正直に書きます。</w:t>
-      </w:r>
-      <w:r>
-        <w:rPr>
-          <w:rFonts w:ascii="Hiragino Sans" w:hAnsi="Hiragino Sans" w:cs="Hiragino Sans"/>
-          <w:sz w:val="29"/>
-          <w:sz-cs w:val="29"/>
-          <w:b/>
-          <w:spacing w:val="0"/>
-        </w:rPr>
-        <w:t xml:space="preserve">ビジュアル系は、いま元気とは言えません。</w:t>
-      </w:r>
-      <w:r>
-        <w:rPr>
-          <w:rFonts w:ascii="Hiragino Sans" w:hAnsi="Hiragino Sans" w:cs="Hiragino Sans"/>
-          <w:sz w:val="29"/>
-          <w:sz-cs w:val="29"/>
-          <w:spacing w:val="0"/>
-        </w:rPr>
-        <w:t xml:space="preserve"/>
-      </w:r>
-    </w:p>
-    <w:p>
-      <w:pPr>
-        <w:spacing w:after="240"/>
-      </w:pPr>
-      <w:r>
-        <w:rPr>
-          <w:rFonts w:ascii="Hiragino Sans" w:hAnsi="Hiragino Sans" w:cs="Hiragino Sans"/>
-          <w:sz w:val="29"/>
-          <w:sz-cs w:val="29"/>
-          <w:spacing w:val="0"/>
-        </w:rPr>
-        <w:t xml:space="preserve">私たちが憧れて聴いていた頃とくらべて、バンドの数も、集まる人の熱量も、細くなってきている。新しく始める若い子が減って、シーンそのものが小さくなっていく感覚があります。</w:t>
-      </w:r>
-    </w:p>
-    <w:p>
-      <w:pPr>
-        <w:spacing w:after="240"/>
-      </w:pPr>
-      <w:r>
-        <w:rPr>
-          <w:rFonts w:ascii="Hiragino Sans" w:hAnsi="Hiragino Sans" w:cs="Hiragino Sans"/>
-          <w:sz w:val="29"/>
-          <w:sz-cs w:val="29"/>
-          <w:spacing w:val="0"/>
-        </w:rPr>
-        <w:t xml:space="preserve">でも、この文化がつまらなくなったわけじゃない。</w:t>
-      </w:r>
+        <w:t xml:space="preserve">正直に書きます。私たちが夢中になっていた頃とくらべて、</w:t>
+      </w:r>
+      <w:r>
+        <w:rPr>
+          <w:rFonts w:ascii="Hiragino Sans" w:hAnsi="Hiragino Sans" w:cs="Hiragino Sans"/>
+          <w:sz w:val="29"/>
+          <w:sz-cs w:val="29"/>
+          <w:b/>
+          <w:spacing w:val="0"/>
+        </w:rPr>
+        <w:t xml:space="preserve">ビジュアル系に出会える場所は、確実に少なくなりました。</w:t>
+      </w:r>
+      <w:r>
+        <w:rPr>
+          <w:rFonts w:ascii="Hiragino Sans" w:hAnsi="Hiragino Sans" w:cs="Hiragino Sans"/>
+          <w:sz w:val="29"/>
+          <w:sz-cs w:val="29"/>
+          <w:spacing w:val="0"/>
+        </w:rPr>
+        <w:t xml:space="preserve"/>
+      </w:r>
+    </w:p>
+    <w:p>
+      <w:pPr>
+        <w:spacing w:after="240"/>
+      </w:pPr>
+      <w:r>
+        <w:rPr>
+          <w:rFonts w:ascii="Hiragino Sans" w:hAnsi="Hiragino Sans" w:cs="Hiragino Sans"/>
+          <w:sz w:val="29"/>
+          <w:sz-cs w:val="29"/>
+          <w:spacing w:val="0"/>
+        </w:rPr>
+        <w:t xml:space="preserve">鳴らしている人も、聴いている人も、変わらずそこにいます。足りないのは場所のほうです。</w:t>
+      </w:r>
+    </w:p>
+    <w:p>
+      <w:pPr>
+        <w:spacing w:after="240"/>
+      </w:pPr>
       <w:r>
         <w:rPr>
           <w:rFonts w:ascii="Hiragino Sans" w:hAnsi="Hiragino Sans" w:cs="Hiragino Sans"/>
@@ -2877,31 +2868,26 @@
           <w:sz-cs w:val="29"/>
           <w:spacing w:val="0"/>
         </w:rPr>
-        <w:t xml:space="preserve">はじめに、ひとつだけ書かせてください。</w:t>
-      </w:r>
-    </w:p>
-    <w:p>
-      <w:pPr>
-        <w:spacing w:after="240"/>
-      </w:pPr>
-      <w:r>
-        <w:rPr>
-          <w:rFonts w:ascii="Hiragino Sans" w:hAnsi="Hiragino Sans" w:cs="Hiragino Sans"/>
-          <w:sz w:val="29"/>
-          <w:sz-cs w:val="29"/>
-          <w:b/>
-          <w:spacing w:val="0"/>
-        </w:rPr>
-        <w:t xml:space="preserve">これはホストとしての活動ではありません。</w:t>
-      </w:r>
-      <w:r>
-        <w:rPr>
-          <w:rFonts w:ascii="Hiragino Sans" w:hAnsi="Hiragino Sans" w:cs="Hiragino Sans"/>
-          <w:sz w:val="29"/>
-          <w:sz-cs w:val="29"/>
-          <w:spacing w:val="0"/>
-        </w:rPr>
-        <w:t xml:space="preserve">VALHALLA というバンドとして、音楽で社会に関わっていきたいという想いから始まっています。</w:t>
+        <w:t xml:space="preserve">この一夜は、</w:t>
+      </w:r>
+      <w:r>
+        <w:rPr>
+          <w:rFonts w:ascii="Hiragino Sans" w:hAnsi="Hiragino Sans" w:cs="Hiragino Sans"/>
+          <w:sz w:val="29"/>
+          <w:sz-cs w:val="29"/>
+          <w:b/>
+          <w:spacing w:val="0"/>
+        </w:rPr>
+        <w:t xml:space="preserve">VALHALLA というバンドとして、音楽で社会に関わっていきたい</w:t>
+      </w:r>
+      <w:r>
+        <w:rPr>
+          <w:rFonts w:ascii="Hiragino Sans" w:hAnsi="Hiragino Sans" w:cs="Hiragino Sans"/>
+          <w:sz w:val="29"/>
+          <w:sz-cs w:val="29"/>
+          <w:spacing w:val="0"/>
+        </w:rPr>
+        <w:t xml:space="preserve">という想いから始まっています。</w:t>
       </w:r>
     </w:p>
     <w:p>
@@ -3143,7 +3129,40 @@
           <w:sz-cs w:val="29"/>
           <w:spacing w:val="0"/>
         </w:rPr>
-        <w:t xml:space="preserve">：2026年10月18日（日） OPEN 19:00 ／ START 19:30 ／ 終演 21:10</w:t>
+        <w:t xml:space="preserve">：2026年10月18日（日） OPEN 19:00 ／ START 19:30 ／ </w:t>
+      </w:r>
+      <w:r>
+        <w:rPr>
+          <w:rFonts w:ascii="Hiragino Sans" w:hAnsi="Hiragino Sans" w:cs="Hiragino Sans"/>
+          <w:sz w:val="29"/>
+          <w:sz-cs w:val="29"/>
+          <w:b/>
+          <w:spacing w:val="0"/>
+        </w:rPr>
+        <w:t xml:space="preserve">ライブ終演 20:05</w:t>
+      </w:r>
+      <w:r>
+        <w:rPr>
+          <w:rFonts w:ascii="Hiragino Sans" w:hAnsi="Hiragino Sans" w:cs="Hiragino Sans"/>
+          <w:sz w:val="29"/>
+          <w:sz-cs w:val="29"/>
+          <w:spacing w:val="0"/>
+        </w:rPr>
+        <w:t xml:space="preserve"/>
+      </w:r>
+    </w:p>
+    <w:p>
+      <w:pPr>
+        <w:spacing w:after="240"/>
+      </w:pPr>
+      <w:r>
+        <w:rPr>
+          <w:rFonts w:ascii="Hiragino Sans" w:hAnsi="Hiragino Sans" w:cs="Hiragino Sans"/>
+          <w:sz w:val="29"/>
+          <w:sz-cs w:val="29"/>
+          <w:spacing w:val="0"/>
+        </w:rPr>
+        <w:t xml:space="preserve">（VVIP席のみ 21:10 まで。MIO とのお時間があるため）</w:t>
       </w:r>
     </w:p>
     <w:p>

</xml_diff>